<commit_message>
improved the wording for proposal
</commit_message>
<xml_diff>
--- a/CA1-Main Body-Srategic Thinking-10-09-V2.docx
+++ b/CA1-Main Body-Srategic Thinking-10-09-V2.docx
@@ -105,7 +105,25 @@
           <w:sz w:val="24"/>
           <w:szCs w:val="24"/>
         </w:rPr>
-        <w:t>Labor</w:t>
+        <w:t>Labo</w:t>
+      </w:r>
+      <w:r>
+        <w:rPr>
+          <w:rFonts w:ascii="Times New Roman" w:eastAsia="Calibri" w:hAnsi="Times New Roman" w:cs="Times New Roman"/>
+          <w:color w:val="000000" w:themeColor="text1"/>
+          <w:sz w:val="24"/>
+          <w:szCs w:val="24"/>
+        </w:rPr>
+        <w:t>u</w:t>
+      </w:r>
+      <w:r>
+        <w:rPr>
+          <w:rFonts w:ascii="Times New Roman" w:eastAsia="Calibri" w:hAnsi="Times New Roman" w:cs="Times New Roman"/>
+          <w:color w:val="000000" w:themeColor="text1"/>
+          <w:sz w:val="24"/>
+          <w:szCs w:val="24"/>
+        </w:rPr>
+        <w:t>r</w:t>
       </w:r>
       <w:r>
         <w:rPr>
@@ -192,17 +210,47 @@
           <w:sz w:val="24"/>
           <w:szCs w:val="24"/>
         </w:rPr>
-        <w:t xml:space="preserve">By the end of 2025, the Irish tourism industry has employed 226,800 people and is the largest indigenous sectoral employer in regional Ireland according </w:t>
-      </w:r>
-      <w:r>
-        <w:rPr>
-          <w:rFonts w:ascii="Times New Roman" w:hAnsi="Times New Roman" w:cs="Times New Roman"/>
+        <w:t>By the end of 2025, the Irish tourism industry has employed 226,800 people and is the largest indigenous sectoral employer in regional Ireland</w:t>
+      </w:r>
+      <w:r>
+        <w:rPr>
+          <w:rFonts w:ascii="Times New Roman" w:hAnsi="Times New Roman" w:cs="Times New Roman"/>
+          <w:color w:val="000000" w:themeColor="text1"/>
+          <w:sz w:val="24"/>
+          <w:szCs w:val="24"/>
+        </w:rPr>
+        <w:t xml:space="preserve"> according</w:t>
+      </w:r>
+      <w:r>
+        <w:rPr>
+          <w:rFonts w:ascii="Times New Roman" w:hAnsi="Times New Roman" w:cs="Times New Roman"/>
+          <w:color w:val="000000" w:themeColor="text1"/>
+          <w:sz w:val="24"/>
+          <w:szCs w:val="24"/>
+        </w:rPr>
+        <w:t xml:space="preserve"> to</w:t>
+      </w:r>
+      <w:r>
+        <w:rPr>
+          <w:rFonts w:ascii="Times New Roman" w:hAnsi="Times New Roman" w:cs="Times New Roman"/>
+          <w:b/>
+          <w:bCs/>
+          <w:color w:val="000000" w:themeColor="text1"/>
+          <w:sz w:val="24"/>
+          <w:szCs w:val="24"/>
+        </w:rPr>
+        <w:t xml:space="preserve"> </w:t>
+      </w:r>
+      <w:r>
+        <w:rPr>
+          <w:rFonts w:ascii="Times New Roman" w:hAnsi="Times New Roman" w:cs="Times New Roman"/>
+          <w:b/>
+          <w:bCs/>
           <w:i/>
           <w:iCs/>
           <w:color w:val="000000" w:themeColor="text1"/>
           <w:sz w:val="24"/>
           <w:szCs w:val="24"/>
-          <w:highlight w:val="yellow"/>
         </w:rPr>
         <w:t>the Irish Tourism Review 2025 &amp; Outlook 2026</w:t>
       </w:r>
@@ -311,6 +359,7 @@
         </w:rPr>
         <w:t xml:space="preserve">as </w:t>
       </w:r>
+      <w:proofErr w:type="spellStart"/>
       <w:r>
         <w:rPr>
           <w:rFonts w:ascii="Times New Roman" w:hAnsi="Times New Roman" w:cs="Times New Roman"/>
@@ -319,8 +368,29 @@
           <w:szCs w:val="24"/>
           <w:lang w:val="en-US"/>
         </w:rPr>
-        <w:t>labor</w:t>
-      </w:r>
+        <w:t>labo</w:t>
+      </w:r>
+      <w:r>
+        <w:rPr>
+          <w:rFonts w:ascii="Times New Roman" w:hAnsi="Times New Roman" w:cs="Times New Roman"/>
+          <w:color w:val="000000" w:themeColor="text1"/>
+          <w:sz w:val="24"/>
+          <w:szCs w:val="24"/>
+          <w:lang w:val="en-US"/>
+        </w:rPr>
+        <w:t>u</w:t>
+      </w:r>
+      <w:r>
+        <w:rPr>
+          <w:rFonts w:ascii="Times New Roman" w:hAnsi="Times New Roman" w:cs="Times New Roman"/>
+          <w:color w:val="000000" w:themeColor="text1"/>
+          <w:sz w:val="24"/>
+          <w:szCs w:val="24"/>
+          <w:lang w:val="en-US"/>
+        </w:rPr>
+        <w:t>r</w:t>
+      </w:r>
+      <w:proofErr w:type="spellEnd"/>
       <w:r>
         <w:rPr>
           <w:rFonts w:ascii="Times New Roman" w:hAnsi="Times New Roman" w:cs="Times New Roman"/>
@@ -389,6 +459,7 @@
         </w:rPr>
         <w:t xml:space="preserve"> investigate the </w:t>
       </w:r>
+      <w:proofErr w:type="spellStart"/>
       <w:r>
         <w:rPr>
           <w:rFonts w:ascii="Times New Roman" w:hAnsi="Times New Roman" w:cs="Times New Roman"/>
@@ -397,8 +468,29 @@
           <w:szCs w:val="24"/>
           <w:lang w:val="en-US"/>
         </w:rPr>
-        <w:t>labor</w:t>
-      </w:r>
+        <w:t>labo</w:t>
+      </w:r>
+      <w:r>
+        <w:rPr>
+          <w:rFonts w:ascii="Times New Roman" w:hAnsi="Times New Roman" w:cs="Times New Roman"/>
+          <w:color w:val="000000" w:themeColor="text1"/>
+          <w:sz w:val="24"/>
+          <w:szCs w:val="24"/>
+          <w:lang w:val="en-US"/>
+        </w:rPr>
+        <w:t>u</w:t>
+      </w:r>
+      <w:r>
+        <w:rPr>
+          <w:rFonts w:ascii="Times New Roman" w:hAnsi="Times New Roman" w:cs="Times New Roman"/>
+          <w:color w:val="000000" w:themeColor="text1"/>
+          <w:sz w:val="24"/>
+          <w:szCs w:val="24"/>
+          <w:lang w:val="en-US"/>
+        </w:rPr>
+        <w:t>r</w:t>
+      </w:r>
+      <w:proofErr w:type="spellEnd"/>
       <w:r>
         <w:rPr>
           <w:rFonts w:ascii="Times New Roman" w:hAnsi="Times New Roman" w:cs="Times New Roman"/>
@@ -777,8 +869,20 @@
           <w:szCs w:val="24"/>
           <w:lang w:val="en-US"/>
         </w:rPr>
-        <w:t xml:space="preserve"> labor</w:t>
-      </w:r>
+        <w:t xml:space="preserve"> </w:t>
+      </w:r>
+      <w:proofErr w:type="spellStart"/>
+      <w:r>
+        <w:rPr>
+          <w:rFonts w:ascii="Times New Roman" w:hAnsi="Times New Roman" w:cs="Times New Roman"/>
+          <w:color w:val="000000" w:themeColor="text1"/>
+          <w:sz w:val="24"/>
+          <w:szCs w:val="24"/>
+          <w:lang w:val="en-US"/>
+        </w:rPr>
+        <w:t>labour</w:t>
+      </w:r>
+      <w:proofErr w:type="spellEnd"/>
       <w:r>
         <w:rPr>
           <w:rFonts w:ascii="Times New Roman" w:eastAsiaTheme="minorEastAsia" w:hAnsi="Times New Roman" w:cs="Times New Roman" w:hint="eastAsia"/>
@@ -1312,7 +1416,7 @@
           <w:sz w:val="24"/>
           <w:szCs w:val="24"/>
         </w:rPr>
-        <w:t xml:space="preserve"> and standardize the operational dataset—including null values, sales figures, staffing numbers, and temporal factors</w:t>
+        <w:t xml:space="preserve"> and standardize the operational dataset—including null values, staff numbers, and temporal factors</w:t>
       </w:r>
       <w:r>
         <w:rPr>
@@ -1544,7 +1648,7 @@
           <w:szCs w:val="24"/>
           <w:lang w:eastAsia="zh-CN"/>
         </w:rPr>
-        <w:t>labor</w:t>
+        <w:t>labour</w:t>
       </w:r>
       <w:r>
         <w:rPr>
@@ -2136,7 +2240,16 @@
           <w:sz w:val="24"/>
           <w:szCs w:val="24"/>
         </w:rPr>
-        <w:t xml:space="preserve"> labor</w:t>
+        <w:t xml:space="preserve"> </w:t>
+      </w:r>
+      <w:r>
+        <w:rPr>
+          <w:rFonts w:ascii="Times New Roman" w:hAnsi="Times New Roman" w:cs="Times New Roman"/>
+          <w:color w:val="000000" w:themeColor="text1"/>
+          <w:sz w:val="24"/>
+          <w:szCs w:val="24"/>
+        </w:rPr>
+        <w:t>labour</w:t>
       </w:r>
       <w:r>
         <w:rPr>
@@ -3068,7 +3181,6 @@
           <w:color w:val="000000" w:themeColor="text1"/>
           <w:sz w:val="24"/>
           <w:szCs w:val="24"/>
-          <w:highlight w:val="yellow"/>
         </w:rPr>
         <w:t>includes</w:t>
       </w:r>
@@ -3078,7 +3190,6 @@
           <w:color w:val="000000" w:themeColor="text1"/>
           <w:sz w:val="24"/>
           <w:szCs w:val="24"/>
-          <w:highlight w:val="yellow"/>
         </w:rPr>
         <w:t xml:space="preserve"> </w:t>
       </w:r>
@@ -3088,7 +3199,6 @@
           <w:color w:val="000000" w:themeColor="text1"/>
           <w:sz w:val="24"/>
           <w:szCs w:val="24"/>
-          <w:highlight w:val="yellow"/>
         </w:rPr>
         <w:t>1000</w:t>
       </w:r>
@@ -3098,7 +3208,6 @@
           <w:color w:val="000000" w:themeColor="text1"/>
           <w:sz w:val="24"/>
           <w:szCs w:val="24"/>
-          <w:highlight w:val="yellow"/>
         </w:rPr>
         <w:t xml:space="preserve"> rows of daily operational records (representing </w:t>
       </w:r>
@@ -3109,7 +3218,16 @@
           <w:sz w:val="24"/>
           <w:szCs w:val="24"/>
         </w:rPr>
-        <w:t>period from 1</w:t>
+        <w:t>period</w:t>
+      </w:r>
+      <w:r>
+        <w:rPr>
+          <w:rFonts w:ascii="Times New Roman" w:hAnsi="Times New Roman" w:cs="Times New Roman"/>
+          <w:color w:val="000000" w:themeColor="text1"/>
+          <w:sz w:val="24"/>
+          <w:szCs w:val="24"/>
+        </w:rPr>
+        <w:t xml:space="preserve"> from 1</w:t>
       </w:r>
       <w:r>
         <w:rPr>
@@ -3484,48 +3602,26 @@
     <w:p>
       <w:pPr>
         <w:rPr>
-          <w:rFonts w:eastAsiaTheme="minorEastAsia"/>
-          <w:color w:val="000000" w:themeColor="text1"/>
-          <w:lang w:eastAsia="zh-CN"/>
-        </w:rPr>
-      </w:pPr>
-    </w:p>
-    <w:p>
-      <w:pPr>
-        <w:rPr>
-          <w:rFonts w:ascii="Times New Roman" w:eastAsiaTheme="minorEastAsia" w:hAnsi="Times New Roman" w:cs="Times New Roman"/>
-          <w:b/>
-          <w:bCs/>
-          <w:color w:val="000000" w:themeColor="text1"/>
-          <w:sz w:val="24"/>
-          <w:szCs w:val="24"/>
-          <w:lang w:eastAsia="zh-CN"/>
-        </w:rPr>
-      </w:pPr>
-      <w:r>
-        <w:rPr>
-          <w:rFonts w:ascii="Times New Roman" w:eastAsiaTheme="minorEastAsia" w:hAnsi="Times New Roman" w:cs="Times New Roman"/>
-          <w:b/>
-          <w:bCs/>
-          <w:color w:val="000000" w:themeColor="text1"/>
-          <w:sz w:val="24"/>
-          <w:szCs w:val="24"/>
-          <w:lang w:eastAsia="zh-CN"/>
-        </w:rPr>
-        <w:t>9.</w:t>
-      </w:r>
-      <w:r>
-        <w:rPr>
-          <w:rFonts w:ascii="Times New Roman" w:eastAsiaTheme="minorEastAsia" w:hAnsi="Times New Roman" w:cs="Times New Roman"/>
-          <w:b/>
-          <w:bCs/>
-          <w:color w:val="000000" w:themeColor="text1"/>
-          <w:sz w:val="24"/>
-          <w:szCs w:val="24"/>
-          <w:highlight w:val="yellow"/>
-          <w:lang w:eastAsia="zh-CN"/>
-        </w:rPr>
-        <w:t>1 Overall Timeline</w:t>
+          <w:rFonts w:ascii="Times New Roman" w:eastAsiaTheme="minorEastAsia" w:hAnsi="Times New Roman" w:cs="Times New Roman"/>
+          <w:b/>
+          <w:bCs/>
+          <w:color w:val="000000" w:themeColor="text1"/>
+          <w:sz w:val="24"/>
+          <w:szCs w:val="24"/>
+          <w:lang w:eastAsia="zh-CN"/>
+        </w:rPr>
+      </w:pPr>
+      <w:r>
+        <w:rPr>
+          <w:rFonts w:ascii="Times New Roman" w:eastAsiaTheme="minorEastAsia" w:hAnsi="Times New Roman" w:cs="Times New Roman"/>
+          <w:b/>
+          <w:bCs/>
+          <w:color w:val="000000" w:themeColor="text1"/>
+          <w:sz w:val="24"/>
+          <w:szCs w:val="24"/>
+          <w:lang w:eastAsia="zh-CN"/>
+        </w:rPr>
+        <w:t>9.1 Overall Timeline</w:t>
       </w:r>
     </w:p>
     <w:p>
@@ -3597,11 +3693,7 @@
       <w:pPr>
         <w:rPr>
           <w:rFonts w:ascii="Times New Roman" w:eastAsiaTheme="minorEastAsia" w:hAnsi="Times New Roman" w:cs="Times New Roman"/>
-          <w:b/>
-          <w:bCs/>
-          <w:color w:val="000000" w:themeColor="text1"/>
-          <w:sz w:val="24"/>
-          <w:szCs w:val="24"/>
+          <w:color w:val="000000" w:themeColor="text1"/>
           <w:lang w:eastAsia="zh-CN"/>
         </w:rPr>
       </w:pPr>
@@ -3647,7 +3739,7 @@
           <w:lang w:eastAsia="zh-CN"/>
         </w:rPr>
         <w:drawing>
-          <wp:inline distT="0" distB="0" distL="0" distR="0" wp14:anchorId="39F84A55" wp14:editId="5A5CD844">
+          <wp:inline distT="0" distB="0" distL="0" distR="0" wp14:anchorId="39F84A55" wp14:editId="45BDFBEE">
             <wp:extent cx="5731510" cy="2250440"/>
             <wp:effectExtent l="0" t="0" r="2540" b="0"/>
             <wp:docPr id="9" name="Picture 9"/>
@@ -3721,6 +3813,7 @@
           <w:bCs/>
           <w:color w:val="000000" w:themeColor="text1"/>
         </w:rPr>
+        <w:lastRenderedPageBreak/>
         <w:t>10. Ethical and Legal Considerations</w:t>
       </w:r>
     </w:p>

</xml_diff>